<commit_message>
docs: strengthen documentation interpretation boundaries
</commit_message>
<xml_diff>
--- a/docs/project_description/exports/detailed_documentation.docx
+++ b/docs/project_description/exports/detailed_documentation.docx
@@ -1256,6 +1256,512 @@
         <w:t>- Event-Alignment gegen Event-Registry,</w:t>
         <w:br/>
         <w:t>- Review Queue fuer Peaks ohne glaubwuerdiges Event-Match oder mit Mehrfachueberlappung.</w:t>
+      </w:r>
+    </w:p>
+    <w:p>
+      <w:pPr>
+        <w:pStyle w:val="Heading2"/>
+      </w:pPr>
+      <w:r>
+        <w:t>7.12 Semantik und Interpretationsgrenzen der Scores</w:t>
+      </w:r>
+    </w:p>
+    <w:p>
+      <w:pPr>
+        <w:spacing w:after="120"/>
+      </w:pPr>
+      <w:r>
+        <w:t>Die wichtigste methodische Leitplanke lautet: Ein Score ist im aktuellen Projektstand kein direkter Realwelt-Risiko- oder Prognosewert. Er beschreibt einen Modellzustand innerhalb eines definierten Beobachtungs- und Aggregationsschemas.</w:t>
+      </w:r>
+    </w:p>
+    <w:p>
+      <w:pPr>
+        <w:spacing w:after="120"/>
+      </w:pPr>
+      <w:r>
+        <w:t>Fuer den klassischen Clusterpfad bedeutet das:</w:t>
+      </w:r>
+    </w:p>
+    <w:p>
+      <w:pPr>
+        <w:spacing w:after="120"/>
+      </w:pPr>
+      <w:r>
+        <w:t>- Ein hoher Cluster-Score zeigt eine hohe aggregierte Signalstaerke innerhalb der modellierten Featurefamilien.</w:t>
+        <w:br/>
+        <w:t>- Er zeigt nicht automatisch eine objektive oder kausal gesicherte Destabilisierung im politischen Sinn.</w:t>
+        <w:br/>
+        <w:t>- Er ist stark davon abhaengig, welche Features in den Cluster aufgenommen wurden und wie gut diese Features die beobachtete Dynamik in der konkreten Situation repraesentieren.</w:t>
+      </w:r>
+    </w:p>
+    <w:p>
+      <w:pPr>
+        <w:spacing w:after="120"/>
+      </w:pPr>
+      <w:r>
+        <w:t>Fuer den Fusionpfad gilt analog:</w:t>
+      </w:r>
+    </w:p>
+    <w:p>
+      <w:pPr>
+        <w:spacing w:after="120"/>
+      </w:pPr>
+      <w:r>
+        <w:t>- Ein hoher Fusion-Score zeigt eine gewichtete Auffaelligkeit ueber mehrere Layer bei gegebener Freshness-, Coverage- und Decay-Logik.</w:t>
+        <w:br/>
+        <w:t>- Er ist kein Wahrscheinlichkeitswert fuer Krieg, Regimekollaps oder gesellschaftlichen Umbruch.</w:t>
+        <w:br/>
+        <w:t>- Er verdichtet heterogene Beobachtungen in einen gemeinsamen Ergebnisraum und muss deshalb immer zusammen mit Gruppenstatus, Layerbeitraegen und Confidence gelesen werden.</w:t>
+      </w:r>
+    </w:p>
+    <w:p>
+      <w:pPr>
+        <w:spacing w:after="120"/>
+      </w:pPr>
+      <w:r>
+        <w:t>Wichtige Interpretationsmuster:</w:t>
+      </w:r>
+    </w:p>
+    <w:p>
+      <w:pPr>
+        <w:spacing w:after="120"/>
+      </w:pPr>
+      <w:r>
+        <w:t>| Muster | Inhaltliche Bedeutung | Analystische Reaktion |</w:t>
+        <w:br/>
+        <w:t>|---|---|---|</w:t>
+        <w:br/>
+        <w:t>| hoher Score, hohe Confidence | starke Auffaelligkeit mit relativ guter Evidenzbasis | vertiefte inhaltliche Pruefung, Priorisierung fuer Review |</w:t>
+        <w:br/>
+        <w:t>| hoher Score, niedrige Confidence | starke Auffaelligkeit bei lueckenhafter oder alternder Evidenz | vorsichtige Interpretation, Datenlage und dominante Quellen zuerst pruefen |</w:t>
+        <w:br/>
+        <w:t>| niedriger Score, hohe Confidence | robuste Nicht-Auffaelligkeit im beobachteten Modell | Monitoring fortsetzen, keine Eskalation allein aus dem Score ableiten |</w:t>
+        <w:br/>
+        <w:t>| niedriger Score, niedrige Confidence | wenig beobachtete Auffaelligkeit bei zugleich schwacher Datenbasis | nicht mit Entwarnung verwechseln; Coverage/Freshness separat betrachten |</w:t>
+      </w:r>
+    </w:p>
+    <w:p>
+      <w:pPr>
+        <w:spacing w:after="120"/>
+      </w:pPr>
+      <w:r>
+        <w:t>Explizit unzulaessige Interpretationen sind:</w:t>
+      </w:r>
+    </w:p>
+    <w:p>
+      <w:pPr>
+        <w:spacing w:after="120"/>
+      </w:pPr>
+      <w:r>
+        <w:t>- kausale Zuschreibungen allein aus dem Score,</w:t>
+        <w:br/>
+        <w:t>- operative Policy- oder Sicherheitsentscheidungen ohne zusaetzliche menschliche Analyse,</w:t>
+        <w:br/>
+        <w:t>- direkte Vergleichbarkeit mit externen Indizes ohne gemeinsame Kalibrierung,</w:t>
+        <w:br/>
+        <w:t>- Gleichsetzung von Confidence mit inhaltlicher Wahrheit.</w:t>
+      </w:r>
+    </w:p>
+    <w:p>
+      <w:pPr>
+        <w:pStyle w:val="Heading2"/>
+      </w:pPr>
+      <w:r>
+        <w:t>7.13 Vergleich von Clusterpfad und Fusionpfad</w:t>
+      </w:r>
+    </w:p>
+    <w:p>
+      <w:pPr>
+        <w:spacing w:after="120"/>
+      </w:pPr>
+      <w:r>
+        <w:t>Beide Ergebnisraeume existieren bewusst parallel, weil sie unterschiedliche Staerken und Risiken haben.</w:t>
+      </w:r>
+    </w:p>
+    <w:p>
+      <w:pPr>
+        <w:spacing w:after="120"/>
+      </w:pPr>
+      <w:r>
+        <w:t>| Aspekt | Clusterpfad | Fusionpfad |</w:t>
+        <w:br/>
+        <w:t>|---|---|---|</w:t>
+        <w:br/>
+        <w:t>| Primaerer Zweck | Kontinuitaet, einfache Lesbarkeit, robuste Kernsicht | breitere Multi-Source-Sicht mit staerkerer Diagnostik |</w:t>
+        <w:br/>
+        <w:t>| Datenbasis | Legacy-Kernquellen und klassische Features | heterogene Quellbasis ueber kanonische Observations |</w:t>
+        <w:br/>
+        <w:t>| Ergebnisraum | Spannung, Eskalation, Verwundbarkeit | event, narrative, governance, market_food, shock, displacement, structural plus Gesamtscore |</w:t>
+        <w:br/>
+        <w:t>| Zeithorizont | Snapshot und rolling history | Snapshot und monatliche historische Fusion |</w:t>
+        <w:br/>
+        <w:t>| Interpretierbarkeit | sehr hoch | hoch, aber komplexer wegen Layer-/Coverage-Logik |</w:t>
+        <w:br/>
+        <w:t>| Robustheit gegen partielle Quellluecken | relativ hoch | gruppen- und layerabhaengig |</w:t>
+        <w:br/>
+        <w:t>| Diagnostische Schaerfe | mittel | hoch bis sehr hoch |</w:t>
+        <w:br/>
+        <w:t>| Hauptrisiko | Vereinfachung und begrenzte Quellbreite | Ueberkomplexitaet, Kalibrierungsdrift, dominante Einzelgruppen |</w:t>
+      </w:r>
+    </w:p>
+    <w:p>
+      <w:pPr>
+        <w:spacing w:after="120"/>
+      </w:pPr>
+      <w:r>
+        <w:t>Faustregel fuer die Nutzung:</w:t>
+      </w:r>
+    </w:p>
+    <w:p>
+      <w:pPr>
+        <w:spacing w:after="120"/>
+      </w:pPr>
+      <w:r>
+        <w:t>- Der Clusterpfad ist der bevorzugte Ergebnisraum fuer stabile, schnell lesbare Basisbeobachtung.</w:t>
+        <w:br/>
+        <w:t>- Der Fusionpfad ist der bevorzugte Ergebnisraum fuer vertiefte Diagnose, Schichtanalyse, Quelltriangulation und Event-Grounding.</w:t>
+        <w:br/>
+        <w:t>- Wenn beide Ergebnisraeume in dieselbe Richtung zeigen, steigt die analystische Plausibilitaet.</w:t>
+        <w:br/>
+        <w:t>- Wenn beide deutlich divergieren, ist dies kein Fehlerindikator an sich, sondern ein Signal fuer erhoehte Review-Beduerftigkeit.</w:t>
+      </w:r>
+    </w:p>
+    <w:p>
+      <w:pPr>
+        <w:pStyle w:val="Heading2"/>
+      </w:pPr>
+      <w:r>
+        <w:t>7.14 Unsicherheitsmodell und Datenqualitaetskette</w:t>
+      </w:r>
+    </w:p>
+    <w:p>
+      <w:pPr>
+        <w:spacing w:after="120"/>
+      </w:pPr>
+      <w:r>
+        <w:t>Das Unsicherheitsmodell ist mehrstufig. Unsicherheit entsteht nicht erst am Ende bei der Anzeige von Confidence, sondern entlang der gesamten Verarbeitungskette.</w:t>
+      </w:r>
+    </w:p>
+    <w:p>
+      <w:pPr>
+        <w:spacing w:after="120"/>
+      </w:pPr>
+      <w:r>
+        <w:t>1. Quellseitige Unsicherheit</w:t>
+        <w:br/>
+        <w:t xml:space="preserve">   - Verfuegbarkeit einzelner Quellen,</w:t>
+        <w:br/>
+        <w:t xml:space="preserve">   - zeitliche Latenz,</w:t>
+        <w:br/>
+        <w:t xml:space="preserve">   - unvollstaendige Abdeckung,</w:t>
+        <w:br/>
+        <w:t xml:space="preserve">   - semantische bzw. taxonomische Ambiguitaet.</w:t>
+      </w:r>
+    </w:p>
+    <w:p>
+      <w:pPr>
+        <w:spacing w:after="120"/>
+      </w:pPr>
+      <w:r>
+        <w:t>2. Transformationsunsicherheit</w:t>
+        <w:br/>
+        <w:t xml:space="preserve">   - Wahl der Normalisierung,</w:t>
+        <w:br/>
+        <w:t xml:space="preserve">   - Mapping auf das kanonische Observation-Schema,</w:t>
+        <w:br/>
+        <w:t xml:space="preserve">   - Verdichtung unterschiedlicher nativer Periodizitaeten,</w:t>
+        <w:br/>
+        <w:t xml:space="preserve">   - Pflege von Gewichten, Schwellen und Layerzuordnungen.</w:t>
+      </w:r>
+    </w:p>
+    <w:p>
+      <w:pPr>
+        <w:spacing w:after="120"/>
+      </w:pPr>
+      <w:r>
+        <w:t>3. Aggregationsunsicherheit</w:t>
+        <w:br/>
+        <w:t xml:space="preserve">   - dominante Einzelquellen oder Einzelgruppen,</w:t>
+        <w:br/>
+        <w:t xml:space="preserve">   - fehlende erwartete Gruppen,</w:t>
+        <w:br/>
+        <w:t xml:space="preserve">   - alternde historische Punkte,</w:t>
+        <w:br/>
+        <w:t xml:space="preserve">   - methodische Empfindlichkeit gegen Parameterwahl.</w:t>
+      </w:r>
+    </w:p>
+    <w:p>
+      <w:pPr>
+        <w:spacing w:after="120"/>
+      </w:pPr>
+      <w:r>
+        <w:t>4. Ausgabeunsicherheit</w:t>
+        <w:br/>
+        <w:t xml:space="preserve">   - starker Score trotz schwacher Confidence,</w:t>
+        <w:br/>
+        <w:t xml:space="preserve">   - Alignment ohne eindeutiges Event-Grounding,</w:t>
+        <w:br/>
+        <w:t xml:space="preserve">   - Peaks mit Mehrfachueberlappungen,</w:t>
+        <w:br/>
+        <w:t xml:space="preserve">   - Review-Queue-Eintraege ohne klares Matching.</w:t>
+      </w:r>
+    </w:p>
+    <w:p>
+      <w:pPr>
+        <w:spacing w:after="120"/>
+      </w:pPr>
+      <w:r>
+        <w:t>Die Systemlogik bildet diese Unsicherheit ueber mehrere Mechanismen ab:</w:t>
+      </w:r>
+    </w:p>
+    <w:p>
+      <w:pPr>
+        <w:spacing w:after="120"/>
+      </w:pPr>
+      <w:r>
+        <w:t>- quality_completeness auf Observation-Ebene,</w:t>
+        <w:br/>
+        <w:t>- Gruppenstatus wie ok, limited, not_available,</w:t>
+        <w:br/>
+        <w:t>- Freshness-/Decay-Faktoren,</w:t>
+        <w:br/>
+        <w:t>- getrennte Score- und Confidence-Fuehrung,</w:t>
+        <w:br/>
+        <w:t>- Dominanz- und Limited-Penalties,</w:t>
+        <w:br/>
+        <w:t>- Event-Alignment-Match-Klassen und Review-Queue.</w:t>
+      </w:r>
+    </w:p>
+    <w:p>
+      <w:pPr>
+        <w:spacing w:after="120"/>
+      </w:pPr>
+      <w:r>
+        <w:t>Praktische Leseregeln fuer Analysten:</w:t>
+      </w:r>
+    </w:p>
+    <w:p>
+      <w:pPr>
+        <w:spacing w:after="120"/>
+      </w:pPr>
+      <w:r>
+        <w:t>| Unsicherheitsmuster | Typische Ursache | Empfohlene Reaktion |</w:t>
+        <w:br/>
+        <w:t>|---|---|---|</w:t>
+        <w:br/>
+        <w:t>| hohe Auffaelligkeit, niedrige Confidence | wenige oder alternde dominante Quellen | Quellenlage, Freshness und Abdeckung zuerst pruefen |</w:t>
+        <w:br/>
+        <w:t>| hohe Confidence, schwache Auffaelligkeit | breite, konsistente Nicht-Auffaelligkeit | als robuste Ruhephase interpretieren, aber externe Kontextpruefung beibehalten |</w:t>
+        <w:br/>
+        <w:t>| starke Layer-Dominanz | einzelne Gruppe treibt Gesamtscore | auf Gruppen- und Source-Signals herunterbrechen |</w:t>
+        <w:br/>
+        <w:t>| schwaches Event-Grounding | Peak ohne gutes Registry-Match | manuelle Fallpruefung und Event-Registry-Hardening priorisieren |</w:t>
+      </w:r>
+    </w:p>
+    <w:p>
+      <w:pPr>
+        <w:pStyle w:val="Heading2"/>
+      </w:pPr>
+      <w:r>
+        <w:t>7.15 Methodische Grenzen und Gueltigkeitsbereich</w:t>
+      </w:r>
+    </w:p>
+    <w:p>
+      <w:pPr>
+        <w:spacing w:after="120"/>
+      </w:pPr>
+      <w:r>
+        <w:t>Der Prototyp ist fuer kurzfristige Signalerkennung und analystische Review-Unterstuetzung gebaut. Das ist sein Gueltigkeitsbereich.</w:t>
+      </w:r>
+    </w:p>
+    <w:p>
+      <w:pPr>
+        <w:spacing w:after="120"/>
+      </w:pPr>
+      <w:r>
+        <w:t>Abgedeckt werden insbesondere:</w:t>
+      </w:r>
+    </w:p>
+    <w:p>
+      <w:pPr>
+        <w:spacing w:after="120"/>
+      </w:pPr>
+      <w:r>
+        <w:t>- heuristische, zeitnahe Sichtbarmachung auffaelliger Dynamiken,</w:t>
+        <w:br/>
+        <w:t>- laendervergleichende Beobachtung innerhalb eines gemeinsamen Modells,</w:t>
+        <w:br/>
+        <w:t>- nachvollziehbare Aggregation heterogener Quellen,</w:t>
+        <w:br/>
+        <w:t>- technische und governance-seitige Reproduzierbarkeit.</w:t>
+      </w:r>
+    </w:p>
+    <w:p>
+      <w:pPr>
+        <w:spacing w:after="120"/>
+      </w:pPr>
+      <w:r>
+        <w:t>Nicht oder nur eingeschraenkt abgedeckt werden:</w:t>
+      </w:r>
+    </w:p>
+    <w:p>
+      <w:pPr>
+        <w:spacing w:after="120"/>
+      </w:pPr>
+      <w:r>
+        <w:t>- tiefe geopolitische Kausalmodelle,</w:t>
+        <w:br/>
+        <w:t>- belastbare Langfristvorhersagen von Regime- oder Kriegspfaden,</w:t>
+        <w:br/>
+        <w:t>- qualitative Akteursintentionen ohne strukturierte Inputs,</w:t>
+        <w:br/>
+        <w:t>- normative oder operative Entscheidungsempfehlungen.</w:t>
+      </w:r>
+    </w:p>
+    <w:p>
+      <w:pPr>
+        <w:spacing w:after="120"/>
+      </w:pPr>
+      <w:r>
+        <w:t>Methodische Grenzen je Layer:</w:t>
+      </w:r>
+    </w:p>
+    <w:p>
+      <w:pPr>
+        <w:spacing w:after="120"/>
+      </w:pPr>
+      <w:r>
+        <w:t>- event: hohe zeitliche Naehe, aber stark registry- und coverage-abhaengig,</w:t>
+        <w:br/>
+        <w:t>- narrative: potenziell sehr frueh sensitiv, aber semantisch taxonomie- und labelanfaellig,</w:t>
+        <w:br/>
+        <w:t>- governance: nuetzlich fuer strukturelle Fragilitaet, aber schwach fuer sehr kurzfristige Dynamik,</w:t>
+        <w:br/>
+        <w:t>- market_food: relevant fuer soziooekonomischen Druck, aber interpretativ kontextabhaengig,</w:t>
+        <w:br/>
+        <w:t>- shock und displacement: wichtige Zusatzsicht, aber stark von externer Datenqualitaet und Periodizitaet abhaengig,</w:t>
+        <w:br/>
+        <w:t>- structural: robuste Baseline, aber bewusst traege gegenueber kurzfristigen Ereignisimpulsen.</w:t>
+      </w:r>
+    </w:p>
+    <w:p>
+      <w:pPr>
+        <w:spacing w:after="120"/>
+      </w:pPr>
+      <w:r>
+        <w:t>Deshalb gilt als zentrale Redlichkeitsregel:</w:t>
+      </w:r>
+    </w:p>
+    <w:p>
+      <w:pPr>
+        <w:spacing w:after="120"/>
+      </w:pPr>
+      <w:r>
+        <w:t>&gt; Score = modellierter Systemzustand unter gegebenen Annahmen, nicht Ground Truth.</w:t>
+      </w:r>
+    </w:p>
+    <w:p>
+      <w:pPr>
+        <w:spacing w:after="120"/>
+      </w:pPr>
+      <w:r>
+        <w:t>Ebenso gilt fuer das Event-Alignment:</w:t>
+      </w:r>
+    </w:p>
+    <w:p>
+      <w:pPr>
+        <w:spacing w:after="120"/>
+      </w:pPr>
+      <w:r>
+        <w:t>&gt; Alignment = Plausibilitaets- und Grounding-Hinweis, nicht Beweis einer kausalen Erklaerung.</w:t>
+      </w:r>
+    </w:p>
+    <w:p>
+      <w:pPr>
+        <w:pStyle w:val="Heading2"/>
+      </w:pPr>
+      <w:r>
+        <w:t>7.16 Evaluationsdesign fuer den naechsten Reifegrad</w:t>
+      </w:r>
+    </w:p>
+    <w:p>
+      <w:pPr>
+        <w:spacing w:after="120"/>
+      </w:pPr>
+      <w:r>
+        <w:t>Fuer den Uebergang vom plausiblen Prototyp zu einem methodisch belastbareren Forschungs- oder Produktartefakt ist ein explizites Evaluationsdesign notwendig. Ein geeignetes Minimaldesign sollte vier Ebenen enthalten:</w:t>
+      </w:r>
+    </w:p>
+    <w:p>
+      <w:pPr>
+        <w:spacing w:after="120"/>
+      </w:pPr>
+      <w:r>
+        <w:t>1. Signalqualitaet</w:t>
+        <w:br/>
+        <w:t xml:space="preserve">   - Sind Peaks zeitlich plausibel?</w:t>
+        <w:br/>
+        <w:t xml:space="preserve">   - Erkennen Cluster- und Fusionpfad bekannte Episoden?</w:t>
+      </w:r>
+    </w:p>
+    <w:p>
+      <w:pPr>
+        <w:spacing w:after="120"/>
+      </w:pPr>
+      <w:r>
+        <w:t>2. Kalibrierung</w:t>
+        <w:br/>
+        <w:t xml:space="preserve">   - Wie sensibel reagieren Ergebnisse auf Gewichte, Schwellen und Freshness-Parameter?</w:t>
+        <w:br/>
+        <w:t xml:space="preserve">   - Wo entstehen stabile Rangfolgen, wo Parameterdrift?</w:t>
+      </w:r>
+    </w:p>
+    <w:p>
+      <w:pPr>
+        <w:spacing w:after="120"/>
+      </w:pPr>
+      <w:r>
+        <w:t>3. Unsicherheitsguete</w:t>
+        <w:br/>
+        <w:t xml:space="preserve">   - Korrelieren hohe Confidence-Werte mit besserem Event-Grounding und stabileren Ergebnisraeumen?</w:t>
+        <w:br/>
+        <w:t xml:space="preserve">   - Signalisieren Penalties tatsaechlich problematische Datenlagen?</w:t>
+      </w:r>
+    </w:p>
+    <w:p>
+      <w:pPr>
+        <w:spacing w:after="120"/>
+      </w:pPr>
+      <w:r>
+        <w:t>4. Analystische Nutzbarkeit</w:t>
+        <w:br/>
+        <w:t xml:space="preserve">   - Verbessern Review-Queue, Layerdiagnostik und Handout die Bearbeitung realer Faelle?</w:t>
+        <w:br/>
+        <w:t xml:space="preserve">   - Welche Darstellungen reduzieren Fehlinterpretationen?</w:t>
+      </w:r>
+    </w:p>
+    <w:p>
+      <w:pPr>
+        <w:spacing w:after="120"/>
+      </w:pPr>
+      <w:r>
+        <w:t>Geeignete Evaluationsartefakte waeren:</w:t>
+      </w:r>
+    </w:p>
+    <w:p>
+      <w:pPr>
+        <w:spacing w:after="120"/>
+      </w:pPr>
+      <w:r>
+        <w:t>- eine kuratierte Event- und Referenzepisodenbasis,</w:t>
+        <w:br/>
+        <w:t>- annotierte Fallstudien fuer mehrere Laender und Zeitfenster,</w:t>
+        <w:br/>
+        <w:t>- Parameter-Sweeps fuer Gewichte, Schwellen und Decay-Regeln,</w:t>
+        <w:br/>
+        <w:t>- systematische Vergleichsauswertungen zwischen Clusterpfad und Fusionpfad,</w:t>
+        <w:br/>
+        <w:t>- Review-Protokolle oder Expertenratings fuer interpretative Guete.</w:t>
       </w:r>
     </w:p>
     <w:p>

</xml_diff>